<commit_message>
Rebrand project for Lycee Louis Armand Paris
</commit_message>
<xml_diff>
--- a/docs/project-guide.docx
+++ b/docs/project-guide.docx
@@ -117,7 +117,7 @@
                                       <w:sz w:val="84"/>
                                       <w:szCs w:val="84"/>
                                     </w:rPr>
-                                    <w:t>Cisco Static Routing, DHCP and DNS Network Project</w:t>
+                                    <w:t>Multi-Site Network Infrastructure for Lycée Louis Armand Paris</w:t>
                                   </w:r>
                                 </w:p>
                                 <w:p>
@@ -372,7 +372,7 @@
                                 <w:sz w:val="84"/>
                                 <w:szCs w:val="84"/>
                               </w:rPr>
-                              <w:t>Cisco Static Routing, DHCP and DNS Network Project</w:t>
+                              <w:t>Multi-Site Network Infrastructure for Lycée Louis Armand Paris</w:t>
                             </w:r>
                           </w:p>
                           <w:p>
@@ -541,7 +541,7 @@
           <w:rFonts w:ascii="Arial" w:hAnsi="Arial"/>
         </w:rPr>
         <w:lastRenderedPageBreak/>
-        <w:t>Cisco Static Routing DHCP and DNS Practice Lab</w:t>
+        <w:t>Multi-Site Network Infrastructure for Lycée Louis Armand Paris</w:t>
       </w:r>
     </w:p>
     <w:p>
@@ -566,7 +566,7 @@
         <w:rPr>
           <w:color w:val="000000"/>
         </w:rPr>
-        <w:t>This document records the three-site Cisco Packet Tracer project that I completed. It preserves the topology, addressing plan, protocol explanations, device configurations, and verification commands so I can return to the project later and understand exactly how it was built.</w:t>
+        <w:t>This document records the multi-site network infrastructure project for Lycée Louis Armand Paris that I completed. It preserves the topology, addressing plan, protocol explanations, device configurations, and verification commands so I can return to the project later and understand exactly how it was built.</w:t>
       </w:r>
     </w:p>
     <w:p>
@@ -1048,7 +1048,7 @@
           <w:rFonts w:ascii="Arial" w:hAnsi="Arial"/>
         </w:rPr>
         <w:lastRenderedPageBreak/>
-        <w:t>1 Lab Overview</w:t>
+        <w:t>1 Project Overview</w:t>
       </w:r>
     </w:p>
     <w:p>
@@ -5639,7 +5639,7 @@
         <w:rPr>
           <w:color w:val="000000"/>
         </w:rPr>
-        <w:t>Domain Name System translates names into IP addresses. This lab uses DNS A records, which map IPv4 host names such as dns.practice.lab to 192.168.20.10. DNS normally uses UDP port 53 and can use TCP port 53 for larger responses or zone transfers.</w:t>
+        <w:t>Domain Name System translates names into IP addresses. This project uses DNS A records, which map IPv4 host names such as dns.practice.lab to 192.168.20.10. DNS normally uses UDP port 53 and can use TCP port 53 for larger responses or zone transfers.</w:t>
       </w:r>
     </w:p>
     <w:p>
@@ -5662,7 +5662,7 @@
         <w:rPr>
           <w:color w:val="000000"/>
         </w:rPr>
-        <w:t>A static route is entered manually by an administrator. It tells a router which next-hop address to use for a destination network. Static routing is predictable and useful in small labs, but it does not automatically discover networks like a dynamic routing protocol.</w:t>
+        <w:t>A static route is entered manually by an administrator. It tells a router which next-hop address to use for a destination network. Static routing is predictable and useful in small networks, but it does not automatically discover networks like a dynamic routing protocol.</w:t>
       </w:r>
     </w:p>
     <w:p>
@@ -5685,7 +5685,7 @@
         <w:rPr>
           <w:color w:val="000000"/>
         </w:rPr>
-        <w:t>A floating static route is a backup route with a higher administrative distance than the preferred route. The backup routes in this lab use administrative distance 10, so they enter the routing table only when the primary route is unavailable.</w:t>
+        <w:t>A floating static route is a backup route with a higher administrative distance than the preferred route. The backup routes in this project use administrative distance 10, so they enter the routing table only when the primary route is unavailable.</w:t>
       </w:r>
     </w:p>
     <w:p>
@@ -5754,7 +5754,7 @@
         <w:rPr>
           <w:color w:val="000000"/>
         </w:rPr>
-        <w:t>A VLAN creates a logical Layer 2 broadcast domain. This simple lab uses the default VLAN 1. Each switch receives a VLAN 1 management address so it can be reached from the network.</w:t>
+        <w:t>A VLAN creates a logical Layer 2 broadcast domain. This project uses the default VLAN 1. Each switch receives a VLAN 1 management address so it can be reached from the network.</w:t>
       </w:r>
     </w:p>
     <w:p>
@@ -9978,7 +9978,7 @@
           <w:rFonts w:ascii="Arial" w:hAnsi="Arial"/>
         </w:rPr>
         <w:lastRenderedPageBreak/>
-        <w:t>8 How Static Routing Works in This Lab</w:t>
+        <w:t>8 How Static Routing Works in This Project</w:t>
       </w:r>
     </w:p>
     <w:p>

</xml_diff>